<commit_message>
Drop the cover meta table from the DOCX
</commit_message>
<xml_diff>
--- a/docs/ClipSync-AI-Documentation.docx
+++ b/docs/ClipSync-AI-Documentation.docx
@@ -23,178 +23,6 @@
         <w:t>Your clipboard, with a brain — and nothing ever leaves your machine.</w:t>
       </w:r>
     </w:p>
-    <w:tbl>
-      <w:tblPr>
-        <w:tblStyle w:val="LightGrid-Accent1"/>
-        <w:tblW w:type="auto" w:w="0"/>
-        <w:tblLook w:firstColumn="1" w:firstRow="1" w:lastColumn="0" w:lastRow="0" w:noHBand="0" w:noVBand="1" w:val="04A0"/>
-      </w:tblPr>
-      <w:tblGrid>
-        <w:gridCol w:w="4320"/>
-        <w:gridCol w:w="4320"/>
-      </w:tblGrid>
-      <w:tr>
-        <w:tc>
-          <w:tcPr>
-            <w:tcW w:type="dxa" w:w="4320"/>
-          </w:tcPr>
-          <w:p>
-            <w:r/>
-            <w:r>
-              <w:rPr>
-                <w:b/>
-              </w:rPr>
-            </w:r>
-          </w:p>
-        </w:tc>
-        <w:tc>
-          <w:tcPr>
-            <w:tcW w:type="dxa" w:w="4320"/>
-          </w:tcPr>
-          <w:p>
-            <w:r/>
-            <w:r>
-              <w:rPr>
-                <w:b/>
-              </w:rPr>
-            </w:r>
-          </w:p>
-        </w:tc>
-      </w:tr>
-      <w:tr>
-        <w:tc>
-          <w:tcPr>
-            <w:tcW w:type="dxa" w:w="4320"/>
-          </w:tcPr>
-          <w:p>
-            <w:r>
-              <w:t>Version</w:t>
-            </w:r>
-          </w:p>
-        </w:tc>
-        <w:tc>
-          <w:tcPr>
-            <w:tcW w:type="dxa" w:w="4320"/>
-          </w:tcPr>
-          <w:p>
-            <w:r>
-              <w:t>1.1.1+2 (application)</w:t>
-            </w:r>
-          </w:p>
-        </w:tc>
-      </w:tr>
-      <w:tr>
-        <w:tc>
-          <w:tcPr>
-            <w:tcW w:type="dxa" w:w="4320"/>
-          </w:tcPr>
-          <w:p>
-            <w:r>
-              <w:t>Date</w:t>
-            </w:r>
-          </w:p>
-        </w:tc>
-        <w:tc>
-          <w:tcPr>
-            <w:tcW w:type="dxa" w:w="4320"/>
-          </w:tcPr>
-          <w:p>
-            <w:r>
-              <w:t>September 2026</w:t>
-            </w:r>
-          </w:p>
-        </w:tc>
-      </w:tr>
-      <w:tr>
-        <w:tc>
-          <w:tcPr>
-            <w:tcW w:type="dxa" w:w="4320"/>
-          </w:tcPr>
-          <w:p>
-            <w:r>
-              <w:t>Author</w:t>
-            </w:r>
-          </w:p>
-        </w:tc>
-        <w:tc>
-          <w:tcPr>
-            <w:tcW w:type="dxa" w:w="4320"/>
-          </w:tcPr>
-          <w:p>
-            <w:r>
-              <w:t>venudinesh</w:t>
-            </w:r>
-          </w:p>
-        </w:tc>
-      </w:tr>
-      <w:tr>
-        <w:tc>
-          <w:tcPr>
-            <w:tcW w:type="dxa" w:w="4320"/>
-          </w:tcPr>
-          <w:p>
-            <w:r>
-              <w:t>Repository</w:t>
-            </w:r>
-          </w:p>
-        </w:tc>
-        <w:tc>
-          <w:tcPr>
-            <w:tcW w:type="dxa" w:w="4320"/>
-          </w:tcPr>
-          <w:p>
-            <w:r>
-              <w:t>github.com/venudinesh/clipsync</w:t>
-            </w:r>
-          </w:p>
-        </w:tc>
-      </w:tr>
-      <w:tr>
-        <w:tc>
-          <w:tcPr>
-            <w:tcW w:type="dxa" w:w="4320"/>
-          </w:tcPr>
-          <w:p>
-            <w:r>
-              <w:t>License</w:t>
-            </w:r>
-          </w:p>
-        </w:tc>
-        <w:tc>
-          <w:tcPr>
-            <w:tcW w:type="dxa" w:w="4320"/>
-          </w:tcPr>
-          <w:p>
-            <w:r>
-              <w:t>MIT</w:t>
-            </w:r>
-          </w:p>
-        </w:tc>
-      </w:tr>
-      <w:tr>
-        <w:tc>
-          <w:tcPr>
-            <w:tcW w:type="dxa" w:w="4320"/>
-          </w:tcPr>
-          <w:p>
-            <w:r>
-              <w:t>Status</w:t>
-            </w:r>
-          </w:p>
-        </w:tc>
-        <w:tc>
-          <w:tcPr>
-            <w:tcW w:type="dxa" w:w="4320"/>
-          </w:tcPr>
-          <w:p>
-            <w:r>
-              <w:t>Source only — no binary releases attached</w:t>
-            </w:r>
-          </w:p>
-        </w:tc>
-      </w:tr>
-    </w:tbl>
-    <w:p/>
     <w:p>
       <w:pPr>
         <w:jc w:val="center"/>

</xml_diff>

<commit_message>
DOCX: 12pt body/tables/code, 14pt headings; fix TOC note shrinking body text
</commit_message>
<xml_diff>
--- a/docs/ClipSync-AI-Documentation.docx
+++ b/docs/ClipSync-AI-Documentation.docx
@@ -57,6 +57,10 @@
     </w:p>
     <w:p>
       <w:r>
+        <w:rPr>
+          <w:color w:val="5C5C60"/>
+          <w:sz w:val="20"/>
+        </w:rPr>
         <w:t>Right-click → Update Field in Word to fill the page numbers.</w:t>
       </w:r>
     </w:p>
@@ -112,6 +116,7 @@
             <w:r>
               <w:rPr>
                 <w:b/>
+                <w:sz w:val="28"/>
               </w:rPr>
               <w:t>Platform</w:t>
             </w:r>
@@ -126,6 +131,7 @@
             <w:r>
               <w:rPr>
                 <w:b/>
+                <w:sz w:val="28"/>
               </w:rPr>
               <w:t>What you get</w:t>
             </w:r>
@@ -140,6 +146,7 @@
             <w:r>
               <w:rPr>
                 <w:b/>
+                <w:sz w:val="28"/>
               </w:rPr>
               <w:t>Needs</w:t>
             </w:r>
@@ -549,6 +556,7 @@
             <w:r>
               <w:rPr>
                 <w:b/>
+                <w:sz w:val="28"/>
               </w:rPr>
               <w:t>Shortcut</w:t>
             </w:r>
@@ -563,6 +571,7 @@
             <w:r>
               <w:rPr>
                 <w:b/>
+                <w:sz w:val="28"/>
               </w:rPr>
               <w:t>Does</w:t>
             </w:r>
@@ -665,7 +674,7 @@
       <w:r>
         <w:rPr>
           <w:rFonts w:ascii="Consolas" w:hAnsi="Consolas"/>
-          <w:sz w:val="18"/>
+          <w:sz w:val="24"/>
         </w:rPr>
         <w:t>flutter pub get</w:t>
       </w:r>
@@ -678,7 +687,7 @@
       <w:r>
         <w:rPr>
           <w:rFonts w:ascii="Consolas" w:hAnsi="Consolas"/>
-          <w:sz w:val="18"/>
+          <w:sz w:val="24"/>
         </w:rPr>
         <w:t>flutter build apk --release   # → build/app/outputs/flutter-apk/</w:t>
       </w:r>
@@ -705,7 +714,7 @@
       <w:r>
         <w:rPr>
           <w:rFonts w:ascii="Consolas" w:hAnsi="Consolas"/>
-          <w:sz w:val="18"/>
+          <w:sz w:val="24"/>
         </w:rPr>
         <w:t>windows\build.cmd   # tests first, then x86 + x64 exes</w:t>
       </w:r>
@@ -727,7 +736,7 @@
       <w:r>
         <w:rPr>
           <w:rFonts w:ascii="Consolas" w:hAnsi="Consolas"/>
-          <w:sz w:val="18"/>
+          <w:sz w:val="24"/>
         </w:rPr>
         <w:t>flutter analyze &amp;&amp; flutter test   # 249 Flutter tests</w:t>
       </w:r>
@@ -740,7 +749,7 @@
       <w:r>
         <w:rPr>
           <w:rFonts w:ascii="Consolas" w:hAnsi="Consolas"/>
-          <w:sz w:val="18"/>
+          <w:sz w:val="24"/>
         </w:rPr>
         <w:t>windows\build.cmd tests          # 600 desktop tests</w:t>
       </w:r>
@@ -788,6 +797,7 @@
             <w:r>
               <w:rPr>
                 <w:b/>
+                <w:sz w:val="28"/>
               </w:rPr>
               <w:t>Path</w:t>
             </w:r>
@@ -802,6 +812,7 @@
             <w:r>
               <w:rPr>
                 <w:b/>
+                <w:sz w:val="28"/>
               </w:rPr>
               <w:t>What lives there</w:t>
             </w:r>
@@ -1404,8 +1415,8 @@
     </w:pPr>
     <w:rPr>
       <w:rFonts w:ascii="Calibri" w:hAnsi="Calibri"/>
-      <w:color w:val="5C5C60"/>
-      <w:sz w:val="18"/>
+      <w:color w:val="1A1A1C"/>
+      <w:sz w:val="24"/>
     </w:rPr>
   </w:style>
   <w:style w:type="paragraph" w:styleId="Header">
@@ -1495,7 +1506,7 @@
       <w:b/>
       <w:bCs/>
       <w:color w:val="3F6B52"/>
-      <w:sz w:val="26"/>
+      <w:sz w:val="28"/>
       <w:szCs w:val="26"/>
     </w:rPr>
   </w:style>

</xml_diff>

<commit_message>
Docs: drop license section, rebuild DOCX + PDF
</commit_message>
<xml_diff>
--- a/docs/ClipSync-AI-Documentation.docx
+++ b/docs/ClipSync-AI-Documentation.docx
@@ -651,24 +651,6 @@
       </w:tr>
     </w:tbl>
     <w:p/>
-    <w:p>
-      <w:pPr>
-        <w:pStyle w:val="Heading1"/>
-      </w:pPr>
-      <w:r>
-        <w:t>7  License</w:t>
-      </w:r>
-    </w:p>
-    <w:p>
-      <w:r>
-        <w:t>MIT — do what you like, just keep the notice.</w:t>
-      </w:r>
-    </w:p>
-    <w:p>
-      <w:r>
-        <w:t>This document describes the source as it stands. There are no binary releases attached to the repository; every build above reproduces from this tree.</w:t>
-      </w:r>
-    </w:p>
     <w:sectPr>
       <w:pgSz w:w="12240" w:h="15840"/>
       <w:pgMar w:top="1440" w:right="1800" w:bottom="1440" w:left="1800" w:header="720" w:footer="720" w:gutter="0"/>

</xml_diff>

<commit_message>
Restore the Android build, gate it in CI, and rewrite the project voice
The dependency refresh left the Android build broken: AGP 9's built-in
Kotlin mode cannot configure this Flutter plugin set. The app now builds
on AGP 8.13, Gradle 8.14 and Kotlin 2.2, with file_picker 11 and
permission_handler 12, and the release APK was installed and launched on
a device.

CI now runs Flutter analyze/tests, an Android APK build, and the Windows
native suite under both the in-box and Roslyn compilers. Windows also
gains optional Authenticode signing.

The public docs speak in the first person, the generated DOCX/PDF were
regenerated, and the ASCII banner comments are gone.
</commit_message>
<xml_diff>
--- a/docs/ClipSync-AI-Documentation.docx
+++ b/docs/ClipSync-AI-Documentation.docx
@@ -20,7 +20,7 @@
         <w:jc w:val="center"/>
       </w:pPr>
       <w:r>
-        <w:t>Your clipboard, with a brain — and nothing ever leaves your machine.</w:t>
+        <w:t>A clipboard that does its thinking on your machine.</w:t>
       </w:r>
     </w:p>
     <w:p>
@@ -28,7 +28,7 @@
         <w:jc w:val="center"/>
       </w:pPr>
       <w:r>
-        <w:t>Product documentation: what the app does, how it keeps your data yours, and how to build and verify it yourself.</w:t>
+        <w:t>What it does, how it keeps your data on your device, and how to build and check it yourself.</w:t>
       </w:r>
     </w:p>
     <w:p>
@@ -79,12 +79,12 @@
     </w:p>
     <w:p>
       <w:r>
-        <w:t>Every “smart clipboard” app takes the most sensitive thing on your device — your clipboard, full of passwords, one-time codes, half-written messages, medical notes — and ships it off to somebody else’s server. That is backwards. ClipSync AI does all of its thinking right there on your own hardware.</w:t>
+        <w:t>Clipboard tools have a bad habit: they take the most sensitive text on your device, the passwords, one-time codes and half-written messages you copy all day, and send it to a server so the “smart” parts can work. I wanted the opposite. ClipSync AI does its thinking on your own hardware.</w:t>
       </w:r>
     </w:p>
     <w:p>
       <w:r>
-        <w:t>No account. No server. No telemetry. No “we value your privacy” page that means nothing. Just an app that works with the Wi-Fi off.</w:t>
+        <w:t>No account, no server, no telemetry. Just an app that works with the Wi-Fi off.</w:t>
       </w:r>
     </w:p>
     <w:p>
@@ -221,7 +221,7 @@
         <w:pStyle w:val="ListBullet"/>
       </w:pPr>
       <w:r>
-        <w:t>It has never sent a single clip anywhere. That is not a setting — there is simply no code that does it.</w:t>
+        <w:t>Nothing leaves the phone unless you configure a cloud provider yourself. That path is off by default, and the app confirms before sending.</w:t>
       </w:r>
     </w:p>
     <w:p>

</xml_diff>